<commit_message>
docs: refresh user guide — favourites & daily review (17 pages, v0.13)
</commit_message>
<xml_diff>
--- a/docs/USER-GUIDE.docx
+++ b/docs/USER-GUIDE.docx
@@ -910,7 +910,7 @@
         <w:pStyle w:val="ListBullet"/>
       </w:pPr>
       <w:r>
-        <w:t>收藏的生词集中在「⭐ 收藏夹」复习（见 3.9）。</w:t>
+        <w:t>收藏的生词进入「⭐ 收藏夹」，从第二天起参加每日复习（见 3.9）。</w:t>
       </w:r>
     </w:p>
     <w:p>
@@ -1131,7 +1131,7 @@
       <w:r>
         <w:drawing>
           <wp:inline xmlns:a="http://schemas.openxmlformats.org/drawingml/2006/main" xmlns:pic="http://schemas.openxmlformats.org/drawingml/2006/picture">
-            <wp:extent cx="5328000" cy="2045571"/>
+            <wp:extent cx="5400000" cy="2715429"/>
             <wp:docPr id="10" name="Picture 10"/>
             <wp:cNvGraphicFramePr>
               <a:graphicFrameLocks noChangeAspect="1"/>
@@ -1152,7 +1152,7 @@
                   <pic:spPr>
                     <a:xfrm>
                       <a:off x="0" y="0"/>
-                      <a:ext cx="5328000" cy="2045571"/>
+                      <a:ext cx="5400000" cy="2715429"/>
                     </a:xfrm>
                     <a:prstGeom prst="rect"/>
                   </pic:spPr>
@@ -1174,7 +1174,7 @@
           <w:color w:val="6B7280"/>
           <w:sz w:val="17"/>
         </w:rPr>
-        <w:t>每日打卡面板：目标圆环（默认 20 分钟）/ 连续天数 / 最近 7 天 / 累计统计</w:t>
+        <w:t>每日打卡面板：目标圆环（默认 20 分钟）/ 连续天数 / 最近 7 天 / 「今日复习」进度行 / 累计统计</w:t>
       </w:r>
     </w:p>
     <w:p>
@@ -1237,6 +1237,14 @@
       </w:pPr>
       <w:r>
         <w:t>连续 3 / 7 / 14 / 30 / 50 / 100 天会触发庆祝动画（见上图）。</w:t>
+      </w:r>
+    </w:p>
+    <w:p>
+      <w:pPr>
+        <w:pStyle w:val="ListBullet"/>
+      </w:pPr>
+      <w:r>
+        <w:t>面板中的「🔁 今日复习 x / y 词」显示当天单词复习进度，点击直达复习（见 3.9）。</w:t>
       </w:r>
     </w:p>
     <w:p>
@@ -1500,7 +1508,7 @@
         <w:pStyle w:val="Heading2"/>
       </w:pPr>
       <w:r>
-        <w:t>3.9  收藏夹</w:t>
+        <w:t>3.9  收藏夹与每日复习</w:t>
       </w:r>
     </w:p>
     <w:p>
@@ -1511,7 +1519,7 @@
       <w:r>
         <w:drawing>
           <wp:inline xmlns:a="http://schemas.openxmlformats.org/drawingml/2006/main" xmlns:pic="http://schemas.openxmlformats.org/drawingml/2006/picture">
-            <wp:extent cx="4248000" cy="4519149"/>
+            <wp:extent cx="3024000" cy="4366174"/>
             <wp:docPr id="16" name="Picture 16"/>
             <wp:cNvGraphicFramePr>
               <a:graphicFrameLocks noChangeAspect="1"/>
@@ -1520,7 +1528,7 @@
               <a:graphicData uri="http://schemas.openxmlformats.org/drawingml/2006/picture">
                 <pic:pic>
                   <pic:nvPicPr>
-                    <pic:cNvPr id="0" name="fig_favorites.png"/>
+                    <pic:cNvPr id="0" name="fig_fav_lib.png"/>
                     <pic:cNvPicPr/>
                   </pic:nvPicPr>
                   <pic:blipFill>
@@ -1532,7 +1540,7 @@
                   <pic:spPr>
                     <a:xfrm>
                       <a:off x="0" y="0"/>
-                      <a:ext cx="4248000" cy="4519149"/>
+                      <a:ext cx="3024000" cy="4366174"/>
                     </a:xfrm>
                     <a:prstGeom prst="rect"/>
                   </pic:spPr>
@@ -1554,7 +1562,115 @@
           <w:color w:val="6B7280"/>
           <w:sz w:val="17"/>
         </w:rPr>
-        <w:t>练习中收藏的生词与句子集中在「⭐ 收藏夹」，支持发音回听</w:t>
+        <w:t>「📚 词库」：词典式列表，每页 8 条、可翻页；支持「最新 / A–Z」排序；点单词查释义、🔊 发音回听、✕ 两步确认删除</w:t>
+      </w:r>
+    </w:p>
+    <w:p>
+      <w:pPr>
+        <w:spacing w:before="120" w:after="40"/>
+        <w:jc w:val="center"/>
+      </w:pPr>
+      <w:r>
+        <w:drawing>
+          <wp:inline xmlns:a="http://schemas.openxmlformats.org/drawingml/2006/main" xmlns:pic="http://schemas.openxmlformats.org/drawingml/2006/picture">
+            <wp:extent cx="4104000" cy="3159783"/>
+            <wp:docPr id="17" name="Picture 17"/>
+            <wp:cNvGraphicFramePr>
+              <a:graphicFrameLocks noChangeAspect="1"/>
+            </wp:cNvGraphicFramePr>
+            <a:graphic>
+              <a:graphicData uri="http://schemas.openxmlformats.org/drawingml/2006/picture">
+                <pic:pic>
+                  <pic:nvPicPr>
+                    <pic:cNvPr id="0" name="fig_fav_review.png"/>
+                    <pic:cNvPicPr/>
+                  </pic:nvPicPr>
+                  <pic:blipFill>
+                    <a:blip r:embed="rId26"/>
+                    <a:stretch>
+                      <a:fillRect/>
+                    </a:stretch>
+                  </pic:blipFill>
+                  <pic:spPr>
+                    <a:xfrm>
+                      <a:off x="0" y="0"/>
+                      <a:ext cx="4104000" cy="3159783"/>
+                    </a:xfrm>
+                    <a:prstGeom prst="rect"/>
+                  </pic:spPr>
+                </pic:pic>
+              </a:graphicData>
+            </a:graphic>
+          </wp:inline>
+        </w:drawing>
+      </w:r>
+    </w:p>
+    <w:p>
+      <w:pPr>
+        <w:spacing w:after="180"/>
+        <w:jc w:val="center"/>
+      </w:pPr>
+      <w:r>
+        <w:rPr>
+          <w:rFonts w:ascii="Microsoft YaHei" w:hAnsi="Microsoft YaHei" w:eastAsia="微软雅黑"/>
+          <w:color w:val="6B7280"/>
+          <w:sz w:val="17"/>
+        </w:rPr>
+        <w:t>「🔁 今日复习」：先回忆 →「显示释义」→ 标记「😵 没记住 / 😎 记住了」；没记住的词当轮再练一遍（第 2 轮），并优先出现在明天</w:t>
+      </w:r>
+    </w:p>
+    <w:p>
+      <w:pPr>
+        <w:spacing w:before="120" w:after="40"/>
+        <w:jc w:val="center"/>
+      </w:pPr>
+      <w:r>
+        <w:drawing>
+          <wp:inline xmlns:a="http://schemas.openxmlformats.org/drawingml/2006/main" xmlns:pic="http://schemas.openxmlformats.org/drawingml/2006/picture">
+            <wp:extent cx="3672000" cy="2627609"/>
+            <wp:docPr id="18" name="Picture 18"/>
+            <wp:cNvGraphicFramePr>
+              <a:graphicFrameLocks noChangeAspect="1"/>
+            </wp:cNvGraphicFramePr>
+            <a:graphic>
+              <a:graphicData uri="http://schemas.openxmlformats.org/drawingml/2006/picture">
+                <pic:pic>
+                  <pic:nvPicPr>
+                    <pic:cNvPr id="0" name="fig_fav_done.png"/>
+                    <pic:cNvPicPr/>
+                  </pic:nvPicPr>
+                  <pic:blipFill>
+                    <a:blip r:embed="rId27"/>
+                    <a:stretch>
+                      <a:fillRect/>
+                    </a:stretch>
+                  </pic:blipFill>
+                  <pic:spPr>
+                    <a:xfrm>
+                      <a:off x="0" y="0"/>
+                      <a:ext cx="3672000" cy="2627609"/>
+                    </a:xfrm>
+                    <a:prstGeom prst="rect"/>
+                  </pic:spPr>
+                </pic:pic>
+              </a:graphicData>
+            </a:graphic>
+          </wp:inline>
+        </w:drawing>
+      </w:r>
+    </w:p>
+    <w:p>
+      <w:pPr>
+        <w:spacing w:after="180"/>
+        <w:jc w:val="center"/>
+      </w:pPr>
+      <w:r>
+        <w:rPr>
+          <w:rFonts w:ascii="Microsoft YaHei" w:hAnsi="Microsoft YaHei" w:eastAsia="微软雅黑"/>
+          <w:color w:val="6B7280"/>
+          <w:sz w:val="17"/>
+        </w:rPr>
+        <w:t>复习完成：记住 X · 待加强 Y；完成进度同步到打卡面板的「今日复习」行</w:t>
       </w:r>
     </w:p>
     <w:p>
@@ -1562,7 +1678,23 @@
         <w:pStyle w:val="ListBullet"/>
       </w:pPr>
       <w:r>
-        <w:t>在对话中点任意单词、或收藏反馈卡里的 Revision 句子，都会进入这里。</w:t>
+        <w:t>复习计划：每天复习词数 = 收藏单词总量 × 比例（默认 30%，最少 5 词、最多 30 词），优先安排从未复习、上次没记住、久未复习的词。</w:t>
+      </w:r>
+    </w:p>
+    <w:p>
+      <w:pPr>
+        <w:pStyle w:val="ListBullet"/>
+      </w:pPr>
+      <w:r>
+        <w:t>在对话中点任意单词、或收藏反馈卡里的 Revision 句子，都会进入词库。</w:t>
+      </w:r>
+    </w:p>
+    <w:p>
+      <w:pPr>
+        <w:pStyle w:val="ListBullet"/>
+      </w:pPr>
+      <w:r>
+        <w:t>复习比例可在 app/config.yaml 的 review 一节调整（ratio / min_per_day / max_per_day）。</w:t>
       </w:r>
     </w:p>
     <w:p>
@@ -1923,6 +2055,28 @@
           </w:p>
         </w:tc>
       </w:tr>
+      <w:tr>
+        <w:tc>
+          <w:tcPr>
+            <w:tcW w:type="dxa" w:w="4819"/>
+          </w:tcPr>
+          <w:p>
+            <w:r>
+              <w:t>每天复习多少个单词 / 怎么调整</w:t>
+            </w:r>
+          </w:p>
+        </w:tc>
+        <w:tc>
+          <w:tcPr>
+            <w:tcW w:type="dxa" w:w="4819"/>
+          </w:tcPr>
+          <w:p>
+            <w:r>
+              <w:t>默认按收藏量的 30% 抽取（最少 5、最多 30 词）；改 app/config.yaml 的 review.ratio / min_per_day / max_per_day</w:t>
+            </w:r>
+          </w:p>
+        </w:tc>
+      </w:tr>
     </w:tbl>
     <w:p>
       <w:pPr>
@@ -1975,7 +2129,7 @@
           <w:color w:val="6B7280"/>
           <w:sz w:val="18"/>
         </w:rPr>
-        <w:t>本项目基于 MIT 协议开源 · 问题反馈请提 GitHub Issue　| 　手册版本 2026-09（对应应用 v0.12）</w:t>
+        <w:t>本项目基于 MIT 协议开源 · 问题反馈请提 GitHub Issue　| 　手册版本 2026-09（对应应用 v0.13）</w:t>
       </w:r>
     </w:p>
     <w:sectPr>

</xml_diff>

<commit_message>
feat(prompts): corporate-grade interviewer personas + benchmark sample answers
- Personas rewritten: positioning, interviewer profile, evaluation focus,
  probing strategy and a realistic interview-dialogue few-shot each;
  follow-ups constrained to <=25 spoken words, no invented facts/numbers
- Sample answers upgraded: benchmarked to real corporate-interview
  expectations, anti-cliché rules, per-question-type structures, a
  careless-vs-benchmark few-shot pair, concrete placeholder guidance,
  and round-aware calibration (HR / technical / pressure)
- README zh+en refreshed; user guide rebuilt (17 pages)
</commit_message>
<xml_diff>
--- a/docs/USER-GUIDE.docx
+++ b/docs/USER-GUIDE.docx
@@ -730,7 +730,7 @@
         <w:pStyle w:val="ListBullet"/>
       </w:pPr>
       <w:r>
-        <w:t>3 种面试官人格：温和 HR（行为面）/ 技术面试官（研究深挖）/ 压力面；3 套题集：基线 8 题、核心面试题集、外企 60 题。</w:t>
+        <w:t>3 种面试官人格：外企 HR 初面（行为面）/ 技术主管面（研究深挖）/ 压力面（终面）——人格含明确定位、评估维度与真实面试对话示例，追问贴合轮次；3 套题集：基线 8 题、核心面试题集、外企 60 题。</w:t>
       </w:r>
     </w:p>
     <w:p>
@@ -817,6 +817,14 @@
           <w:sz w:val="17"/>
         </w:rPr>
         <w:t>左：导入简历后的「🎯 定制版」（用你的经历与数字组织答案）；右：开箱即用的「🧩 通用版」（含 [方括号] 占位符，替换成自己的信息即可）</w:t>
+      </w:r>
+    </w:p>
+    <w:p>
+      <w:pPr>
+        <w:pStyle w:val="ListBullet"/>
+      </w:pPr>
+      <w:r>
+        <w:t>答案按「对标真实企业面试标准」撰写：结论先行 + 证据 / 数字 + 去客套与学生腔；同一题可「↻ 换一版」换个说法。</w:t>
       </w:r>
     </w:p>
     <w:p>

</xml_diff>